<commit_message>
Update provenance doc and add code comparison document
Co-Authored-By: Claude Opus 4.6 (1M context) <noreply@anthropic.com>
</commit_message>
<xml_diff>
--- a/docs/provenance/chloe_scale_explorer_provenance.docx
+++ b/docs/provenance/chloe_scale_explorer_provenance.docx
@@ -1247,7 +1247,7 @@
           <w:sz w:val="22"/>
           <w:szCs w:val="22"/>
         </w:rPr>
-        <w:t xml:space="preserve">Ian Ring, a Canadian composer, has published an essay titled “A Study of Scales” on his website (ianring.com/musictheory/scales). This essay describes the same fundamental concept: representing musical scales as 12-bit binary numbers, where each bit corresponds to a semitone, and the decimal value serves as a unique identifier for each scale (e.g., major scale = 2741). Ring’s essay also describes modes as bit rotations and enumerates the full 4096-element power set. The essay includes a preface stating it was “written in 2009,” however the earliest independently verifiable online publication date, based on Wayback Machine (web.archive.org) captures of the URL, is 2017. No archived captures, external citations, forum posts, or links to the essay from before 2017 have been found. The claimed authorship date of 2009 cannot be independently corroborated.</w:t>
+        <w:t xml:space="preserve">Ian Ring, a Canadian composer, has published an essay titled “A Study of Scales” on his website (ianring.com/musictheory/scales). This essay describes the same fundamental concept: representing musical scales as 12-bit binary numbers, where each bit corresponds to a semitone, and the decimal value serves as a unique identifier for each scale (e.g., major scale = 2741). Ring’s essay also describes modes as bit rotations and enumerates the full 4096-element power set. The essay includes a preface stating it was “written in 2009,” however the earliest independently verifiable online publication date is November 6, 2017, confirmed by the first Wayback Machine capture of the URL (https://web.archive.org/web/20171106060403/https://ianring.com/musictheory/scales/). No archived captures, external citations, forum posts, or links to the essay from before November 2017 have been found. The claimed authorship date of 2009 cannot be independently corroborated. This first archived capture predates the author’s own Facebook post and GitHub commit by only six weeks.</w:t>
       </w:r>
     </w:p>
     <w:p>
@@ -1992,7 +1992,7 @@
                 <w:sz w:val="20"/>
                 <w:szCs w:val="20"/>
               </w:rPr>
-              <w:t xml:space="preserve">2017 (claimed 2009)</w:t>
+              <w:t xml:space="preserve">Nov 6, 2017 (claimed 2009)</w:t>
             </w:r>
           </w:p>
         </w:tc>
@@ -2023,7 +2023,7 @@
                 <w:sz w:val="20"/>
                 <w:szCs w:val="20"/>
               </w:rPr>
-              <w:t xml:space="preserve">Ian Ring’s “A Study of Scales” first verifiably appears online (ianring.com/musictheory/scales). Essay preface claims it was written in 2009; no independent evidence supports online publication before 2017.</w:t>
+              <w:t xml:space="preserve">First Wayback Machine capture of Ian Ring’s “A Study of Scales” (web.archive.org/web/20171106060403/https://ianring.com/musictheory/scales/). Essay preface claims it was written in 2009; no archived captures or external links from before this date have been found. This capture predates the author’s Facebook post by six weeks.</w:t>
             </w:r>
           </w:p>
         </w:tc>

</xml_diff>